<commit_message>
Git: branches mescladas apagadas com tags rodada/<nome>; histórico e papel da main para depois (ROADMAP)
- 15 branches já mescladas em staging_main apagadas (13 spec/*, ajuste_eixos,
  inclusao_dados_protecao), ponto final de cada uma em tag anotada rodada/<nome>.
- ROADMAP, backlog Repositório (git): tamanho do histórico (não reescrever por ora;
  Release/LFS para o PDF e o DOCX), papel da main, commits da branch da Waleska.
- Convenção registrada na constituição §7, no CLAUDE.md e na especificação (DOCX regerado).

Co-Authored-By: Claude Opus 5.5 <noreply@anthropic.com>
</commit_message>
<xml_diff>
--- a/docs/especificacao_projeto.docx
+++ b/docs/especificacao_projeto.docx
@@ -5568,7 +5568,7 @@
               <a:graphicData uri="http://schemas.openxmlformats.org/drawingml/2006/picture">
                 <pic:pic>
                   <pic:nvPicPr>
-                    <pic:cNvPr descr="C:/Users/130736~1/AppData/Local/Temp/claude/C--Users-13073625755-Documents-GitHub-analise-primeira-infancia/162fb892-f833-42f3-be59-f51603e2a20d/scratchpad/docx/diagrama.png" id="20" name="Picture"/>
+                    <pic:cNvPr descr="C:/Users/130736~1/AppData/Local/Temp/claude/C--Users-13073625755-Documents-GitHub-analise-primeira-infancia/162fb892-f833-42f3-be59-f51603e2a20d/scratchpad/docx2/diagrama.png" id="20" name="Picture"/>
                     <pic:cNvPicPr>
                       <a:picLocks noChangeArrowheads="1" noChangeAspect="1"/>
                     </pic:cNvPicPr>
@@ -8600,6 +8600,24 @@
           <w:rStyle w:val="VerbatimChar"/>
         </w:rPr>
         <w:t xml:space="preserve">staging_main</w:t>
+      </w:r>
+      <w:r>
+        <w:t xml:space="preserve">; depois a branch pode ser</w:t>
+      </w:r>
+      <w:r>
+        <w:t xml:space="preserve"> </w:t>
+      </w:r>
+      <w:r>
+        <w:t xml:space="preserve">apagada, com o ponto final guardado na tag</w:t>
+      </w:r>
+      <w:r>
+        <w:t xml:space="preserve"> </w:t>
+      </w:r>
+      <w:r>
+        <w:rPr>
+          <w:rStyle w:val="VerbatimChar"/>
+        </w:rPr>
+        <w:t xml:space="preserve">rodada/&lt;nome&gt;</w:t>
       </w:r>
       <w:r>
         <w:t xml:space="preserve">. Refatorações seguem a regra</w:t>

</xml_diff>